<commit_message>
Canon Addendum 1 rev 2 - Founders Badge final terms,  anchor restored
</commit_message>
<xml_diff>
--- a/Patents/Canon_Addendum_1_FoundersBadge.docx
+++ b/Patents/Canon_Addendum_1_FoundersBadge.docx
@@ -48,7 +48,7 @@
           <w:sz w:val="22"/>
           <w:szCs w:val="22"/>
         </w:rPr>
-        <w:t xml:space="preserve">Final terms, the Ruby Spark, and the supersessions that bring every canonical document in line</w:t>
+        <w:t xml:space="preserve">Final terms, the restored $2 anchor, the Ruby Spark, and the supersessions that bring every canonical document in line</w:t>
       </w:r>
     </w:p>
     <w:p>
@@ -62,7 +62,7 @@
           <w:sz w:val="18"/>
           <w:szCs w:val="18"/>
         </w:rPr>
-        <w:t xml:space="preserve">6 June 2026 · Owner: David · To be folded into the next versions of the Codex (v4.7→), WhitePaper (v3.4→), IP Brief (v5→) and EULA (v1.5→v1.6)</w:t>
+        <w:t xml:space="preserve">6 June 2026 (rev 2 — allocations re-synced to the $2 anchor) · Owner: David · To be folded into the next versions of the Codex (v4.7→), WhitePaper (v3.4→), IP Brief (v5→) and EULA (v1.5→v1.6)</w:t>
       </w:r>
     </w:p>
     <w:p>
@@ -170,7 +170,7 @@
                 <w:sz w:val="21"/>
                 <w:szCs w:val="21"/>
               </w:rPr>
-              <w:t xml:space="preserve">. Its §9 programme *mechanics* (the AI-Guidance exchange-rate advantage, the $15 International qualifying tier, the launch-day-only window) are </w:t>
+              <w:t xml:space="preserve">, and so is its founding economic principle: </w:t>
             </w:r>
             <w:r>
               <w:rPr>
@@ -183,7 +183,7 @@
                 <w:sz w:val="21"/>
                 <w:szCs w:val="21"/>
               </w:rPr>
-              <w:t xml:space="preserve">superseded</w:t>
+              <w:t xml:space="preserve">1 Tuppence = US $2.00, fixed, for every user</w:t>
             </w:r>
             <w:r>
               <w:rPr>
@@ -196,7 +196,7 @@
                 <w:sz w:val="21"/>
                 <w:szCs w:val="21"/>
               </w:rPr>
-              <w:t xml:space="preserve"> by the terms below. Every other canonical document is silent on the special and is brought in line by this addendum until its next version absorbs it.</w:t>
+              <w:t xml:space="preserve">. What this addendum supersedes in §9 is narrow: the AI-Guidance exchange-rate advantage (retired with the AI-uses model), the $15 International qualifying tier, and the launch-day-only window. Every other canonical document is silent on the special and is brought in line by this addendum until its next version absorbs it.</w:t>
             </w:r>
           </w:p>
         </w:tc>
@@ -315,7 +315,7 @@
                 <w:sz w:val="18"/>
                 <w:szCs w:val="18"/>
               </w:rPr>
-              <w:t xml:space="preserve">Qualifying action</w:t>
+              <w:t xml:space="preserve">The $2 anchor (restored)</w:t>
             </w:r>
           </w:p>
         </w:tc>
@@ -337,41 +337,54 @@
             <w:r>
               <w:rPr>
                 <w:rFonts w:ascii="Calibri" w:cs="Calibri" w:eastAsia="Calibri" w:hAnsi="Calibri"/>
-                <w:b w:val="false"/>
-                <w:bCs w:val="false"/>
-                <w:i w:val="false"/>
-                <w:iCs w:val="false"/>
-                <w:color w:val="1A2433"/>
-                <w:sz w:val="18"/>
-                <w:szCs w:val="18"/>
-              </w:rPr>
-              <w:t xml:space="preserve">Subscribe to the </w:t>
-            </w:r>
-            <w:r>
-              <w:rPr>
-                <w:rFonts w:ascii="Calibri" w:cs="Calibri" w:eastAsia="Calibri" w:hAnsi="Calibri"/>
-                <w:b/>
-                <w:bCs/>
-                <w:i w:val="false"/>
-                <w:iCs w:val="false"/>
-                <w:color w:val="1A2433"/>
-                <w:sz w:val="18"/>
-                <w:szCs w:val="18"/>
-              </w:rPr>
-              <w:t xml:space="preserve">$40 Business tier</w:t>
-            </w:r>
-            <w:r>
-              <w:rPr>
-                <w:rFonts w:ascii="Calibri" w:cs="Calibri" w:eastAsia="Calibri" w:hAnsi="Calibri"/>
-                <w:b w:val="false"/>
-                <w:bCs w:val="false"/>
-                <w:i w:val="false"/>
-                <w:iCs w:val="false"/>
-                <w:color w:val="1A2433"/>
-                <w:sz w:val="18"/>
-                <w:szCs w:val="18"/>
-              </w:rPr>
-              <w:t xml:space="preserve"> during the launch window, redeeming a launch number.</w:t>
+                <w:b/>
+                <w:bCs/>
+                <w:i w:val="false"/>
+                <w:iCs w:val="false"/>
+                <w:color w:val="1A2433"/>
+                <w:sz w:val="18"/>
+                <w:szCs w:val="18"/>
+              </w:rPr>
+              <w:t xml:space="preserve">1 Tuppence = $2, always.</w:t>
+            </w:r>
+            <w:r>
+              <w:rPr>
+                <w:rFonts w:ascii="Calibri" w:cs="Calibri" w:eastAsia="Calibri" w:hAnsi="Calibri"/>
+                <w:b w:val="false"/>
+                <w:bCs w:val="false"/>
+                <w:i w:val="false"/>
+                <w:iCs w:val="false"/>
+                <w:color w:val="1A2433"/>
+                <w:sz w:val="18"/>
+                <w:szCs w:val="18"/>
+              </w:rPr>
+              <w:t xml:space="preserve"> Every paid tier returns </w:t>
+            </w:r>
+            <w:r>
+              <w:rPr>
+                <w:rFonts w:ascii="Calibri" w:cs="Calibri" w:eastAsia="Calibri" w:hAnsi="Calibri"/>
+                <w:b/>
+                <w:bCs/>
+                <w:i w:val="false"/>
+                <w:iCs w:val="false"/>
+                <w:color w:val="1A2433"/>
+                <w:sz w:val="18"/>
+                <w:szCs w:val="18"/>
+              </w:rPr>
+              <w:t xml:space="preserve">exactly its full price</w:t>
+            </w:r>
+            <w:r>
+              <w:rPr>
+                <w:rFonts w:ascii="Calibri" w:cs="Calibri" w:eastAsia="Calibri" w:hAnsi="Calibri"/>
+                <w:b w:val="false"/>
+                <w:bCs w:val="false"/>
+                <w:i w:val="false"/>
+                <w:iCs w:val="false"/>
+                <w:color w:val="1A2433"/>
+                <w:sz w:val="18"/>
+                <w:szCs w:val="18"/>
+              </w:rPr>
+              <w:t xml:space="preserve"> in Tuppence each month — the same generosity ratio for every subscriber, no tier arbitrage. The pitch: *your subscription comes back to you in Tuppence; the slots and features are what you're buying.*</w:t>
             </w:r>
           </w:p>
         </w:tc>
@@ -403,7 +416,7 @@
                 <w:sz w:val="18"/>
                 <w:szCs w:val="18"/>
               </w:rPr>
-              <w:t xml:space="preserve">Window</w:t>
+              <w:t xml:space="preserve">Monthly allocations (locked)</w:t>
             </w:r>
           </w:p>
         </w:tc>
@@ -425,28 +438,145 @@
             <w:r>
               <w:rPr>
                 <w:rFonts w:ascii="Calibri" w:cs="Calibri" w:eastAsia="Calibri" w:hAnsi="Calibri"/>
-                <w:b/>
-                <w:bCs/>
-                <w:i w:val="false"/>
-                <w:iCs w:val="false"/>
-                <w:color w:val="1A2433"/>
-                <w:sz w:val="18"/>
-                <w:szCs w:val="18"/>
-              </w:rPr>
-              <w:t xml:space="preserve">Launch day → the end of the launch month.</w:t>
-            </w:r>
-            <w:r>
-              <w:rPr>
-                <w:rFonts w:ascii="Calibri" w:cs="Calibri" w:eastAsia="Calibri" w:hAnsi="Calibri"/>
-                <w:b w:val="false"/>
-                <w:bCs w:val="false"/>
-                <w:i w:val="false"/>
-                <w:iCs w:val="false"/>
-                <w:color w:val="1A2433"/>
-                <w:sz w:val="18"/>
-                <w:szCs w:val="18"/>
-              </w:rPr>
-              <w:t xml:space="preserve"> The final, once-ever closing — the minting code is disabled at close and the special is never repeated, at any price, in any promotion.</w:t>
+                <w:b w:val="false"/>
+                <w:bCs w:val="false"/>
+                <w:i w:val="false"/>
+                <w:iCs w:val="false"/>
+                <w:color w:val="1A2433"/>
+                <w:sz w:val="18"/>
+                <w:szCs w:val="18"/>
+              </w:rPr>
+              <w:t xml:space="preserve">$0 Free: </w:t>
+            </w:r>
+            <w:r>
+              <w:rPr>
+                <w:rFonts w:ascii="Calibri" w:cs="Calibri" w:eastAsia="Calibri" w:hAnsi="Calibri"/>
+                <w:b/>
+                <w:bCs/>
+                <w:i w:val="false"/>
+                <w:iCs w:val="false"/>
+                <w:color w:val="1A2433"/>
+                <w:sz w:val="18"/>
+                <w:szCs w:val="18"/>
+              </w:rPr>
+              <w:t xml:space="preserve">2 slots</w:t>
+            </w:r>
+            <w:r>
+              <w:rPr>
+                <w:rFonts w:ascii="Calibri" w:cs="Calibri" w:eastAsia="Calibri" w:hAnsi="Calibri"/>
+                <w:b w:val="false"/>
+                <w:bCs w:val="false"/>
+                <w:i w:val="false"/>
+                <w:iCs w:val="false"/>
+                <w:color w:val="1A2433"/>
+                <w:sz w:val="18"/>
+                <w:szCs w:val="18"/>
+              </w:rPr>
+              <w:t xml:space="preserve"> · $12 Standard: </w:t>
+            </w:r>
+            <w:r>
+              <w:rPr>
+                <w:rFonts w:ascii="Calibri" w:cs="Calibri" w:eastAsia="Calibri" w:hAnsi="Calibri"/>
+                <w:b/>
+                <w:bCs/>
+                <w:i w:val="false"/>
+                <w:iCs w:val="false"/>
+                <w:color w:val="1A2433"/>
+                <w:sz w:val="18"/>
+                <w:szCs w:val="18"/>
+              </w:rPr>
+              <w:t xml:space="preserve">10 slots · 6 T</w:t>
+            </w:r>
+            <w:r>
+              <w:rPr>
+                <w:rFonts w:ascii="Calibri" w:cs="Calibri" w:eastAsia="Calibri" w:hAnsi="Calibri"/>
+                <w:b w:val="false"/>
+                <w:bCs w:val="false"/>
+                <w:i w:val="false"/>
+                <w:iCs w:val="false"/>
+                <w:color w:val="1A2433"/>
+                <w:sz w:val="18"/>
+                <w:szCs w:val="18"/>
+              </w:rPr>
+              <w:t xml:space="preserve"> · $20 Professional: </w:t>
+            </w:r>
+            <w:r>
+              <w:rPr>
+                <w:rFonts w:ascii="Calibri" w:cs="Calibri" w:eastAsia="Calibri" w:hAnsi="Calibri"/>
+                <w:b/>
+                <w:bCs/>
+                <w:i w:val="false"/>
+                <w:iCs w:val="false"/>
+                <w:color w:val="1A2433"/>
+                <w:sz w:val="18"/>
+                <w:szCs w:val="18"/>
+              </w:rPr>
+              <w:t xml:space="preserve">25 slots · 10 T</w:t>
+            </w:r>
+            <w:r>
+              <w:rPr>
+                <w:rFonts w:ascii="Calibri" w:cs="Calibri" w:eastAsia="Calibri" w:hAnsi="Calibri"/>
+                <w:b w:val="false"/>
+                <w:bCs w:val="false"/>
+                <w:i w:val="false"/>
+                <w:iCs w:val="false"/>
+                <w:color w:val="1A2433"/>
+                <w:sz w:val="18"/>
+                <w:szCs w:val="18"/>
+              </w:rPr>
+              <w:t xml:space="preserve"> · $40 Business: </w:t>
+            </w:r>
+            <w:r>
+              <w:rPr>
+                <w:rFonts w:ascii="Calibri" w:cs="Calibri" w:eastAsia="Calibri" w:hAnsi="Calibri"/>
+                <w:b/>
+                <w:bCs/>
+                <w:i w:val="false"/>
+                <w:iCs w:val="false"/>
+                <w:color w:val="1A2433"/>
+                <w:sz w:val="18"/>
+                <w:szCs w:val="18"/>
+              </w:rPr>
+              <w:t xml:space="preserve">60 slots · 20 T</w:t>
+            </w:r>
+            <w:r>
+              <w:rPr>
+                <w:rFonts w:ascii="Calibri" w:cs="Calibri" w:eastAsia="Calibri" w:hAnsi="Calibri"/>
+                <w:b w:val="false"/>
+                <w:bCs w:val="false"/>
+                <w:i w:val="false"/>
+                <w:iCs w:val="false"/>
+                <w:color w:val="1A2433"/>
+                <w:sz w:val="18"/>
+                <w:szCs w:val="18"/>
+              </w:rPr>
+              <w:t xml:space="preserve"> · $100 Elite: </w:t>
+            </w:r>
+            <w:r>
+              <w:rPr>
+                <w:rFonts w:ascii="Calibri" w:cs="Calibri" w:eastAsia="Calibri" w:hAnsi="Calibri"/>
+                <w:b/>
+                <w:bCs/>
+                <w:i w:val="false"/>
+                <w:iCs w:val="false"/>
+                <w:color w:val="1A2433"/>
+                <w:sz w:val="18"/>
+                <w:szCs w:val="18"/>
+              </w:rPr>
+              <w:t xml:space="preserve">500 slots · 50 T</w:t>
+            </w:r>
+            <w:r>
+              <w:rPr>
+                <w:rFonts w:ascii="Calibri" w:cs="Calibri" w:eastAsia="Calibri" w:hAnsi="Calibri"/>
+                <w:b w:val="false"/>
+                <w:bCs w:val="false"/>
+                <w:i w:val="false"/>
+                <w:iCs w:val="false"/>
+                <w:color w:val="1A2433"/>
+                <w:sz w:val="18"/>
+                <w:szCs w:val="18"/>
+              </w:rPr>
+              <w:t xml:space="preserve">. Tuppence is spendable on introductions or any app feature; slots never accumulate.</w:t>
             </w:r>
           </w:p>
         </w:tc>
@@ -478,7 +608,7 @@
                 <w:sz w:val="18"/>
                 <w:szCs w:val="18"/>
               </w:rPr>
-              <w:t xml:space="preserve">Advantage</w:t>
+              <w:t xml:space="preserve">Qualifying action</w:t>
             </w:r>
           </w:p>
         </w:tc>
@@ -500,28 +630,41 @@
             <w:r>
               <w:rPr>
                 <w:rFonts w:ascii="Calibri" w:cs="Calibri" w:eastAsia="Calibri" w:hAnsi="Calibri"/>
-                <w:b/>
-                <w:bCs/>
-                <w:i w:val="false"/>
-                <w:iCs w:val="false"/>
-                <w:color w:val="1A2433"/>
-                <w:sz w:val="18"/>
-                <w:szCs w:val="18"/>
-              </w:rPr>
-              <w:t xml:space="preserve">20% bonus Tuppence on any paid plan, every month, for life</w:t>
-            </w:r>
-            <w:r>
-              <w:rPr>
-                <w:rFonts w:ascii="Calibri" w:cs="Calibri" w:eastAsia="Calibri" w:hAnsi="Calibri"/>
-                <w:b w:val="false"/>
-                <w:bCs w:val="false"/>
-                <w:i w:val="false"/>
-                <w:iCs w:val="false"/>
-                <w:color w:val="1A2433"/>
-                <w:sz w:val="18"/>
-                <w:szCs w:val="18"/>
-              </w:rPr>
-              <w:t xml:space="preserve"> (Business: 72 instead of 60). On the free tier the standard free allocation applies — no bonus; the badge waits and re-applies on any future paid plan.</w:t>
+                <w:b w:val="false"/>
+                <w:bCs w:val="false"/>
+                <w:i w:val="false"/>
+                <w:iCs w:val="false"/>
+                <w:color w:val="1A2433"/>
+                <w:sz w:val="18"/>
+                <w:szCs w:val="18"/>
+              </w:rPr>
+              <w:t xml:space="preserve">Subscribe to the </w:t>
+            </w:r>
+            <w:r>
+              <w:rPr>
+                <w:rFonts w:ascii="Calibri" w:cs="Calibri" w:eastAsia="Calibri" w:hAnsi="Calibri"/>
+                <w:b/>
+                <w:bCs/>
+                <w:i w:val="false"/>
+                <w:iCs w:val="false"/>
+                <w:color w:val="1A2433"/>
+                <w:sz w:val="18"/>
+                <w:szCs w:val="18"/>
+              </w:rPr>
+              <w:t xml:space="preserve">$40 Business or $100 Elite tier</w:t>
+            </w:r>
+            <w:r>
+              <w:rPr>
+                <w:rFonts w:ascii="Calibri" w:cs="Calibri" w:eastAsia="Calibri" w:hAnsi="Calibri"/>
+                <w:b w:val="false"/>
+                <w:bCs w:val="false"/>
+                <w:i w:val="false"/>
+                <w:iCs w:val="false"/>
+                <w:color w:val="1A2433"/>
+                <w:sz w:val="18"/>
+                <w:szCs w:val="18"/>
+              </w:rPr>
+              <w:t xml:space="preserve"> during the launch window, redeeming a launch number. Standard and Professional subscriptions do not mint the badge.</w:t>
             </w:r>
           </w:p>
         </w:tc>
@@ -553,7 +696,7 @@
                 <w:sz w:val="18"/>
                 <w:szCs w:val="18"/>
               </w:rPr>
-              <w:t xml:space="preserve">Distribution</w:t>
+              <w:t xml:space="preserve">Window</w:t>
             </w:r>
           </w:p>
         </w:tc>
@@ -575,41 +718,28 @@
             <w:r>
               <w:rPr>
                 <w:rFonts w:ascii="Calibri" w:cs="Calibri" w:eastAsia="Calibri" w:hAnsi="Calibri"/>
-                <w:b w:val="false"/>
-                <w:bCs w:val="false"/>
-                <w:i w:val="false"/>
-                <w:iCs w:val="false"/>
-                <w:color w:val="1A2433"/>
-                <w:sz w:val="18"/>
-                <w:szCs w:val="18"/>
-              </w:rPr>
-              <w:t xml:space="preserve">Unique, database-controlled numbers (`TSL-XXXX-XXXX-CCCC`, HMAC-tagged). Individual email → one number, one person, one ID. Agency email → one agency number; </w:t>
-            </w:r>
-            <w:r>
-              <w:rPr>
-                <w:rFonts w:ascii="Calibri" w:cs="Calibri" w:eastAsia="Calibri" w:hAnsi="Calibri"/>
-                <w:b/>
-                <w:bCs/>
-                <w:i w:val="false"/>
-                <w:iCs w:val="false"/>
-                <w:color w:val="1A2433"/>
-                <w:sz w:val="18"/>
-                <w:szCs w:val="18"/>
-              </w:rPr>
-              <w:t xml:space="preserve">each registered agent</w:t>
-            </w:r>
-            <w:r>
-              <w:rPr>
-                <w:rFonts w:ascii="Calibri" w:cs="Calibri" w:eastAsia="Calibri" w:hAnsi="Calibri"/>
-                <w:b w:val="false"/>
-                <w:bCs w:val="false"/>
-                <w:i w:val="false"/>
-                <w:iCs w:val="false"/>
-                <w:color w:val="1A2433"/>
-                <w:sz w:val="18"/>
-                <w:szCs w:val="18"/>
-              </w:rPr>
-              <w:t xml:space="preserve"> redeems it once against their own ID.</w:t>
+                <w:b/>
+                <w:bCs/>
+                <w:i w:val="false"/>
+                <w:iCs w:val="false"/>
+                <w:color w:val="1A2433"/>
+                <w:sz w:val="18"/>
+                <w:szCs w:val="18"/>
+              </w:rPr>
+              <w:t xml:space="preserve">Launch day → the end of the launch month.</w:t>
+            </w:r>
+            <w:r>
+              <w:rPr>
+                <w:rFonts w:ascii="Calibri" w:cs="Calibri" w:eastAsia="Calibri" w:hAnsi="Calibri"/>
+                <w:b w:val="false"/>
+                <w:bCs w:val="false"/>
+                <w:i w:val="false"/>
+                <w:iCs w:val="false"/>
+                <w:color w:val="1A2433"/>
+                <w:sz w:val="18"/>
+                <w:szCs w:val="18"/>
+              </w:rPr>
+              <w:t xml:space="preserve"> The final, once-ever closing — the minting code is disabled at close and the special is never repeated, at any price, in any promotion.</w:t>
             </w:r>
           </w:p>
         </w:tc>
@@ -641,7 +771,7 @@
                 <w:sz w:val="18"/>
                 <w:szCs w:val="18"/>
               </w:rPr>
-              <w:t xml:space="preserve">Identity</w:t>
+              <w:t xml:space="preserve">Advantage</w:t>
             </w:r>
           </w:p>
         </w:tc>
@@ -663,41 +793,145 @@
             <w:r>
               <w:rPr>
                 <w:rFonts w:ascii="Calibri" w:cs="Calibri" w:eastAsia="Calibri" w:hAnsi="Calibri"/>
-                <w:b w:val="false"/>
-                <w:bCs w:val="false"/>
-                <w:i w:val="false"/>
-                <w:iCs w:val="false"/>
-                <w:color w:val="1A2433"/>
-                <w:sz w:val="18"/>
-                <w:szCs w:val="18"/>
-              </w:rPr>
-              <w:t xml:space="preserve">Bound to the holder's </w:t>
-            </w:r>
-            <w:r>
-              <w:rPr>
-                <w:rFonts w:ascii="Calibri" w:cs="Calibri" w:eastAsia="Calibri" w:hAnsi="Calibri"/>
-                <w:b/>
-                <w:bCs/>
-                <w:i w:val="false"/>
-                <w:iCs w:val="false"/>
-                <w:color w:val="1A2433"/>
-                <w:sz w:val="18"/>
-                <w:szCs w:val="18"/>
-              </w:rPr>
-              <w:t xml:space="preserve">verified identity as a salted hash</w:t>
-            </w:r>
-            <w:r>
-              <w:rPr>
-                <w:rFonts w:ascii="Calibri" w:cs="Calibri" w:eastAsia="Calibri" w:hAnsi="Calibri"/>
-                <w:b w:val="false"/>
-                <w:bCs w:val="false"/>
-                <w:i w:val="false"/>
-                <w:iCs w:val="false"/>
-                <w:color w:val="1A2433"/>
-                <w:sz w:val="18"/>
-                <w:szCs w:val="18"/>
-              </w:rPr>
-              <w:t xml:space="preserve"> (the KYC flow verifies the real ID; the raw number is never stored in the programme tables). One human, one badge, forever — surviving tier changes, pauses and returns.</w:t>
+                <w:b/>
+                <w:bCs/>
+                <w:i w:val="false"/>
+                <w:iCs w:val="false"/>
+                <w:color w:val="1A2433"/>
+                <w:sz w:val="18"/>
+                <w:szCs w:val="18"/>
+              </w:rPr>
+              <w:t xml:space="preserve">20% bonus Tuppence on any paid plan, every month, for life — rounded up</w:t>
+            </w:r>
+            <w:r>
+              <w:rPr>
+                <w:rFonts w:ascii="Calibri" w:cs="Calibri" w:eastAsia="Calibri" w:hAnsi="Calibri"/>
+                <w:b w:val="false"/>
+                <w:bCs w:val="false"/>
+                <w:i w:val="false"/>
+                <w:iCs w:val="false"/>
+                <w:color w:val="1A2433"/>
+                <w:sz w:val="18"/>
+                <w:szCs w:val="18"/>
+              </w:rPr>
+              <w:t xml:space="preserve">: Standard 6→</w:t>
+            </w:r>
+            <w:r>
+              <w:rPr>
+                <w:rFonts w:ascii="Calibri" w:cs="Calibri" w:eastAsia="Calibri" w:hAnsi="Calibri"/>
+                <w:b/>
+                <w:bCs/>
+                <w:i w:val="false"/>
+                <w:iCs w:val="false"/>
+                <w:color w:val="1A2433"/>
+                <w:sz w:val="18"/>
+                <w:szCs w:val="18"/>
+              </w:rPr>
+              <w:t xml:space="preserve">8</w:t>
+            </w:r>
+            <w:r>
+              <w:rPr>
+                <w:rFonts w:ascii="Calibri" w:cs="Calibri" w:eastAsia="Calibri" w:hAnsi="Calibri"/>
+                <w:b w:val="false"/>
+                <w:bCs w:val="false"/>
+                <w:i w:val="false"/>
+                <w:iCs w:val="false"/>
+                <w:color w:val="1A2433"/>
+                <w:sz w:val="18"/>
+                <w:szCs w:val="18"/>
+              </w:rPr>
+              <w:t xml:space="preserve"> · Professional 10→</w:t>
+            </w:r>
+            <w:r>
+              <w:rPr>
+                <w:rFonts w:ascii="Calibri" w:cs="Calibri" w:eastAsia="Calibri" w:hAnsi="Calibri"/>
+                <w:b/>
+                <w:bCs/>
+                <w:i w:val="false"/>
+                <w:iCs w:val="false"/>
+                <w:color w:val="1A2433"/>
+                <w:sz w:val="18"/>
+                <w:szCs w:val="18"/>
+              </w:rPr>
+              <w:t xml:space="preserve">12</w:t>
+            </w:r>
+            <w:r>
+              <w:rPr>
+                <w:rFonts w:ascii="Calibri" w:cs="Calibri" w:eastAsia="Calibri" w:hAnsi="Calibri"/>
+                <w:b w:val="false"/>
+                <w:bCs w:val="false"/>
+                <w:i w:val="false"/>
+                <w:iCs w:val="false"/>
+                <w:color w:val="1A2433"/>
+                <w:sz w:val="18"/>
+                <w:szCs w:val="18"/>
+              </w:rPr>
+              <w:t xml:space="preserve"> · Business 20→</w:t>
+            </w:r>
+            <w:r>
+              <w:rPr>
+                <w:rFonts w:ascii="Calibri" w:cs="Calibri" w:eastAsia="Calibri" w:hAnsi="Calibri"/>
+                <w:b/>
+                <w:bCs/>
+                <w:i w:val="false"/>
+                <w:iCs w:val="false"/>
+                <w:color w:val="1A2433"/>
+                <w:sz w:val="18"/>
+                <w:szCs w:val="18"/>
+              </w:rPr>
+              <w:t xml:space="preserve">24</w:t>
+            </w:r>
+            <w:r>
+              <w:rPr>
+                <w:rFonts w:ascii="Calibri" w:cs="Calibri" w:eastAsia="Calibri" w:hAnsi="Calibri"/>
+                <w:b w:val="false"/>
+                <w:bCs w:val="false"/>
+                <w:i w:val="false"/>
+                <w:iCs w:val="false"/>
+                <w:color w:val="1A2433"/>
+                <w:sz w:val="18"/>
+                <w:szCs w:val="18"/>
+              </w:rPr>
+              <w:t xml:space="preserve"> · Elite 50→</w:t>
+            </w:r>
+            <w:r>
+              <w:rPr>
+                <w:rFonts w:ascii="Calibri" w:cs="Calibri" w:eastAsia="Calibri" w:hAnsi="Calibri"/>
+                <w:b/>
+                <w:bCs/>
+                <w:i w:val="false"/>
+                <w:iCs w:val="false"/>
+                <w:color w:val="1A2433"/>
+                <w:sz w:val="18"/>
+                <w:szCs w:val="18"/>
+              </w:rPr>
+              <w:t xml:space="preserve">60</w:t>
+            </w:r>
+            <w:r>
+              <w:rPr>
+                <w:rFonts w:ascii="Calibri" w:cs="Calibri" w:eastAsia="Calibri" w:hAnsi="Calibri"/>
+                <w:b w:val="false"/>
+                <w:bCs w:val="false"/>
+                <w:i w:val="false"/>
+                <w:iCs w:val="false"/>
+                <w:color w:val="1A2433"/>
+                <w:sz w:val="18"/>
+                <w:szCs w:val="18"/>
+              </w:rPr>
+              <w:t xml:space="preserve">. Once minted, the badge honours every later state: downgrade to Standard and the 8 T applies; pause for a year and return, and it applies again. Free stays free — no bonus; the badge waits. </w:t>
+            </w:r>
+            <w:r>
+              <w:rPr>
+                <w:rFonts w:ascii="Calibri" w:cs="Calibri" w:eastAsia="Calibri" w:hAnsi="Calibri"/>
+                <w:b/>
+                <w:bCs/>
+                <w:i w:val="false"/>
+                <w:iCs w:val="false"/>
+                <w:color w:val="1A2433"/>
+                <w:sz w:val="18"/>
+                <w:szCs w:val="18"/>
+              </w:rPr>
+              <w:t xml:space="preserve">Listing-slot caps are unchanged by the badge.</w:t>
             </w:r>
           </w:p>
         </w:tc>
@@ -729,7 +963,7 @@
                 <w:sz w:val="18"/>
                 <w:szCs w:val="18"/>
               </w:rPr>
-              <w:t xml:space="preserve">Tiers (canon)</w:t>
+              <w:t xml:space="preserve">Distribution</w:t>
             </w:r>
           </w:p>
         </w:tc>
@@ -751,28 +985,41 @@
             <w:r>
               <w:rPr>
                 <w:rFonts w:ascii="Calibri" w:cs="Calibri" w:eastAsia="Calibri" w:hAnsi="Calibri"/>
-                <w:b/>
-                <w:bCs/>
-                <w:i w:val="false"/>
-                <w:iCs w:val="false"/>
-                <w:color w:val="1A2433"/>
-                <w:sz w:val="18"/>
-                <w:szCs w:val="18"/>
-              </w:rPr>
-              <w:t xml:space="preserve">$0 · $12 · $20 · $40 · $100 per month.</w:t>
-            </w:r>
-            <w:r>
-              <w:rPr>
-                <w:rFonts w:ascii="Calibri" w:cs="Calibri" w:eastAsia="Calibri" w:hAnsi="Calibri"/>
-                <w:b w:val="false"/>
-                <w:bCs w:val="false"/>
-                <w:i w:val="false"/>
-                <w:iCs w:val="false"/>
-                <w:color w:val="1A2433"/>
-                <w:sz w:val="18"/>
-                <w:szCs w:val="18"/>
-              </w:rPr>
-              <w:t xml:space="preserve"> The former $0/$5/$15 structure is retired and must appear nowhere.</w:t>
+                <w:b w:val="false"/>
+                <w:bCs w:val="false"/>
+                <w:i w:val="false"/>
+                <w:iCs w:val="false"/>
+                <w:color w:val="1A2433"/>
+                <w:sz w:val="18"/>
+                <w:szCs w:val="18"/>
+              </w:rPr>
+              <w:t xml:space="preserve">Unique, database-controlled numbers (`TSL-XXXX-XXXX-CCCC`, HMAC-tagged). Individual email → one number, one person, one ID. Agency email → one agency number; </w:t>
+            </w:r>
+            <w:r>
+              <w:rPr>
+                <w:rFonts w:ascii="Calibri" w:cs="Calibri" w:eastAsia="Calibri" w:hAnsi="Calibri"/>
+                <w:b/>
+                <w:bCs/>
+                <w:i w:val="false"/>
+                <w:iCs w:val="false"/>
+                <w:color w:val="1A2433"/>
+                <w:sz w:val="18"/>
+                <w:szCs w:val="18"/>
+              </w:rPr>
+              <w:t xml:space="preserve">each registered agent</w:t>
+            </w:r>
+            <w:r>
+              <w:rPr>
+                <w:rFonts w:ascii="Calibri" w:cs="Calibri" w:eastAsia="Calibri" w:hAnsi="Calibri"/>
+                <w:b w:val="false"/>
+                <w:bCs w:val="false"/>
+                <w:i w:val="false"/>
+                <w:iCs w:val="false"/>
+                <w:color w:val="1A2433"/>
+                <w:sz w:val="18"/>
+                <w:szCs w:val="18"/>
+              </w:rPr>
+              <w:t xml:space="preserve"> redeems it once against their own ID.</w:t>
             </w:r>
           </w:p>
         </w:tc>
@@ -804,7 +1051,7 @@
                 <w:sz w:val="18"/>
                 <w:szCs w:val="18"/>
               </w:rPr>
-              <w:t xml:space="preserve">AI model (canon)</w:t>
+              <w:t xml:space="preserve">Identity</w:t>
             </w:r>
           </w:p>
         </w:tc>
@@ -826,6 +1073,270 @@
             <w:r>
               <w:rPr>
                 <w:rFonts w:ascii="Calibri" w:cs="Calibri" w:eastAsia="Calibri" w:hAnsi="Calibri"/>
+                <w:b w:val="false"/>
+                <w:bCs w:val="false"/>
+                <w:i w:val="false"/>
+                <w:iCs w:val="false"/>
+                <w:color w:val="1A2433"/>
+                <w:sz w:val="18"/>
+                <w:szCs w:val="18"/>
+              </w:rPr>
+              <w:t xml:space="preserve">Bound to the holder's </w:t>
+            </w:r>
+            <w:r>
+              <w:rPr>
+                <w:rFonts w:ascii="Calibri" w:cs="Calibri" w:eastAsia="Calibri" w:hAnsi="Calibri"/>
+                <w:b/>
+                <w:bCs/>
+                <w:i w:val="false"/>
+                <w:iCs w:val="false"/>
+                <w:color w:val="1A2433"/>
+                <w:sz w:val="18"/>
+                <w:szCs w:val="18"/>
+              </w:rPr>
+              <w:t xml:space="preserve">verified identity as a salted hash</w:t>
+            </w:r>
+            <w:r>
+              <w:rPr>
+                <w:rFonts w:ascii="Calibri" w:cs="Calibri" w:eastAsia="Calibri" w:hAnsi="Calibri"/>
+                <w:b w:val="false"/>
+                <w:bCs w:val="false"/>
+                <w:i w:val="false"/>
+                <w:iCs w:val="false"/>
+                <w:color w:val="1A2433"/>
+                <w:sz w:val="18"/>
+                <w:szCs w:val="18"/>
+              </w:rPr>
+              <w:t xml:space="preserve"> (the KYC flow verifies the real ID; the raw number is never stored in the programme tables). One human, one badge, forever.</w:t>
+            </w:r>
+          </w:p>
+        </w:tc>
+      </w:tr>
+      <w:tr>
+        <w:tc>
+          <w:tcPr>
+            <w:tcW w:type="dxa" w:w="2300"/>
+            <w:shd w:fill="F4F6FA" w:color="auto" w:val="clear"/>
+            <w:tcMar>
+              <w:top w:type="dxa" w:w="85"/>
+              <w:left w:type="dxa" w:w="140"/>
+              <w:bottom w:type="dxa" w:w="85"/>
+              <w:right w:type="dxa" w:w="140"/>
+            </w:tcMar>
+          </w:tcPr>
+          <w:p>
+            <w:pPr>
+              <w:spacing w:line="260"/>
+            </w:pPr>
+            <w:r>
+              <w:rPr>
+                <w:rFonts w:ascii="Calibri" w:cs="Calibri" w:eastAsia="Calibri" w:hAnsi="Calibri"/>
+                <w:b/>
+                <w:bCs/>
+                <w:i w:val="false"/>
+                <w:iCs w:val="false"/>
+                <w:color w:val="1A2433"/>
+                <w:sz w:val="18"/>
+                <w:szCs w:val="18"/>
+              </w:rPr>
+              <w:t xml:space="preserve">Slots vs Tuppence (clarity canon)</w:t>
+            </w:r>
+          </w:p>
+        </w:tc>
+        <w:tc>
+          <w:tcPr>
+            <w:tcW w:type="dxa" w:w="7340"/>
+            <w:shd w:fill="F4F6FA" w:color="auto" w:val="clear"/>
+            <w:tcMar>
+              <w:top w:type="dxa" w:w="85"/>
+              <w:left w:type="dxa" w:w="140"/>
+              <w:bottom w:type="dxa" w:w="85"/>
+              <w:right w:type="dxa" w:w="140"/>
+            </w:tcMar>
+          </w:tcPr>
+          <w:p>
+            <w:pPr>
+              <w:spacing w:line="260"/>
+            </w:pPr>
+            <w:r>
+              <w:rPr>
+                <w:rFonts w:ascii="Calibri" w:cs="Calibri" w:eastAsia="Calibri" w:hAnsi="Calibri"/>
+                <w:b/>
+                <w:bCs/>
+                <w:i w:val="false"/>
+                <w:iCs w:val="false"/>
+                <w:color w:val="1A2433"/>
+                <w:sz w:val="18"/>
+                <w:szCs w:val="18"/>
+              </w:rPr>
+              <w:t xml:space="preserve">Listing slots = a capacity ceiling</w:t>
+            </w:r>
+            <w:r>
+              <w:rPr>
+                <w:rFonts w:ascii="Calibri" w:cs="Calibri" w:eastAsia="Calibri" w:hAnsi="Calibri"/>
+                <w:b w:val="false"/>
+                <w:bCs w:val="false"/>
+                <w:i w:val="false"/>
+                <w:iCs w:val="false"/>
+                <w:color w:val="1A2433"/>
+                <w:sz w:val="18"/>
+                <w:szCs w:val="18"/>
+              </w:rPr>
+              <w:t xml:space="preserve"> — the maximum adverts live at any moment; a constant of the tier, never added month to month. </w:t>
+            </w:r>
+            <w:r>
+              <w:rPr>
+                <w:rFonts w:ascii="Calibri" w:cs="Calibri" w:eastAsia="Calibri" w:hAnsi="Calibri"/>
+                <w:b/>
+                <w:bCs/>
+                <w:i w:val="false"/>
+                <w:iCs w:val="false"/>
+                <w:color w:val="1A2433"/>
+                <w:sz w:val="18"/>
+                <w:szCs w:val="18"/>
+              </w:rPr>
+              <w:t xml:space="preserve">Tuppence = spendable currency</w:t>
+            </w:r>
+            <w:r>
+              <w:rPr>
+                <w:rFonts w:ascii="Calibri" w:cs="Calibri" w:eastAsia="Calibri" w:hAnsi="Calibri"/>
+                <w:b w:val="false"/>
+                <w:bCs w:val="false"/>
+                <w:i w:val="false"/>
+                <w:iCs w:val="false"/>
+                <w:color w:val="1A2433"/>
+                <w:sz w:val="18"/>
+                <w:szCs w:val="18"/>
+              </w:rPr>
+              <w:t xml:space="preserve"> — granted monthly. The two must never be displayed as bare numbers without distinct labels, units and visuals (a slot METER — e.g. 41/60 used — versus a WALLET balance). The caps exist to incentivise upgrades and to bound listing volume.</w:t>
+            </w:r>
+          </w:p>
+        </w:tc>
+      </w:tr>
+      <w:tr>
+        <w:tc>
+          <w:tcPr>
+            <w:tcW w:type="dxa" w:w="2300"/>
+            <w:shd w:fill="FFFFFF" w:color="auto" w:val="clear"/>
+            <w:tcMar>
+              <w:top w:type="dxa" w:w="85"/>
+              <w:left w:type="dxa" w:w="140"/>
+              <w:bottom w:type="dxa" w:w="85"/>
+              <w:right w:type="dxa" w:w="140"/>
+            </w:tcMar>
+          </w:tcPr>
+          <w:p>
+            <w:pPr>
+              <w:spacing w:line="260"/>
+            </w:pPr>
+            <w:r>
+              <w:rPr>
+                <w:rFonts w:ascii="Calibri" w:cs="Calibri" w:eastAsia="Calibri" w:hAnsi="Calibri"/>
+                <w:b/>
+                <w:bCs/>
+                <w:i w:val="false"/>
+                <w:iCs w:val="false"/>
+                <w:color w:val="1A2433"/>
+                <w:sz w:val="18"/>
+                <w:szCs w:val="18"/>
+              </w:rPr>
+              <w:t xml:space="preserve">Tiers (canon)</w:t>
+            </w:r>
+          </w:p>
+        </w:tc>
+        <w:tc>
+          <w:tcPr>
+            <w:tcW w:type="dxa" w:w="7340"/>
+            <w:shd w:fill="FFFFFF" w:color="auto" w:val="clear"/>
+            <w:tcMar>
+              <w:top w:type="dxa" w:w="85"/>
+              <w:left w:type="dxa" w:w="140"/>
+              <w:bottom w:type="dxa" w:w="85"/>
+              <w:right w:type="dxa" w:w="140"/>
+            </w:tcMar>
+          </w:tcPr>
+          <w:p>
+            <w:pPr>
+              <w:spacing w:line="260"/>
+            </w:pPr>
+            <w:r>
+              <w:rPr>
+                <w:rFonts w:ascii="Calibri" w:cs="Calibri" w:eastAsia="Calibri" w:hAnsi="Calibri"/>
+                <w:b/>
+                <w:bCs/>
+                <w:i w:val="false"/>
+                <w:iCs w:val="false"/>
+                <w:color w:val="1A2433"/>
+                <w:sz w:val="18"/>
+                <w:szCs w:val="18"/>
+              </w:rPr>
+              <w:t xml:space="preserve">$0 · $12 · $20 · $40 · $100 per month.</w:t>
+            </w:r>
+            <w:r>
+              <w:rPr>
+                <w:rFonts w:ascii="Calibri" w:cs="Calibri" w:eastAsia="Calibri" w:hAnsi="Calibri"/>
+                <w:b w:val="false"/>
+                <w:bCs w:val="false"/>
+                <w:i w:val="false"/>
+                <w:iCs w:val="false"/>
+                <w:color w:val="1A2433"/>
+                <w:sz w:val="18"/>
+                <w:szCs w:val="18"/>
+              </w:rPr>
+              <w:t xml:space="preserve"> The former $0/$5/$15 structure is retired and must appear nowhere.</w:t>
+            </w:r>
+          </w:p>
+        </w:tc>
+      </w:tr>
+      <w:tr>
+        <w:tc>
+          <w:tcPr>
+            <w:tcW w:type="dxa" w:w="2300"/>
+            <w:shd w:fill="F4F6FA" w:color="auto" w:val="clear"/>
+            <w:tcMar>
+              <w:top w:type="dxa" w:w="85"/>
+              <w:left w:type="dxa" w:w="140"/>
+              <w:bottom w:type="dxa" w:w="85"/>
+              <w:right w:type="dxa" w:w="140"/>
+            </w:tcMar>
+          </w:tcPr>
+          <w:p>
+            <w:pPr>
+              <w:spacing w:line="260"/>
+            </w:pPr>
+            <w:r>
+              <w:rPr>
+                <w:rFonts w:ascii="Calibri" w:cs="Calibri" w:eastAsia="Calibri" w:hAnsi="Calibri"/>
+                <w:b/>
+                <w:bCs/>
+                <w:i w:val="false"/>
+                <w:iCs w:val="false"/>
+                <w:color w:val="1A2433"/>
+                <w:sz w:val="18"/>
+                <w:szCs w:val="18"/>
+              </w:rPr>
+              <w:t xml:space="preserve">AI model (canon)</w:t>
+            </w:r>
+          </w:p>
+        </w:tc>
+        <w:tc>
+          <w:tcPr>
+            <w:tcW w:type="dxa" w:w="7340"/>
+            <w:shd w:fill="F4F6FA" w:color="auto" w:val="clear"/>
+            <w:tcMar>
+              <w:top w:type="dxa" w:w="85"/>
+              <w:left w:type="dxa" w:w="140"/>
+              <w:bottom w:type="dxa" w:w="85"/>
+              <w:right w:type="dxa" w:w="140"/>
+            </w:tcMar>
+          </w:tcPr>
+          <w:p>
+            <w:pPr>
+              <w:spacing w:line="260"/>
+            </w:pPr>
+            <w:r>
+              <w:rPr>
+                <w:rFonts w:ascii="Calibri" w:cs="Calibri" w:eastAsia="Calibri" w:hAnsi="Calibri"/>
                 <w:b/>
                 <w:bCs/>
                 <w:i w:val="false"/>
@@ -847,7 +1358,7 @@
                 <w:sz w:val="18"/>
                 <w:szCs w:val="18"/>
               </w:rPr>
-              <w:t xml:space="preserve"> In-app AI guidance is free; advanced AI features are Tuppence-priced per use. All exchange-rate / sessions-per-Tuppence mechanics are retired.</w:t>
+              <w:t xml:space="preserve"> In-app AI guidance is free; advanced AI features are Tuppence-priced per use.</w:t>
             </w:r>
           </w:p>
         </w:tc>
@@ -1054,7 +1565,7 @@
           <w:sz w:val="21"/>
           <w:szCs w:val="21"/>
         </w:rPr>
-        <w:t xml:space="preserve">Benefits run silently server-side off the ID-hash; the holder's only private trace is one wallet-history line (e.g. “Founders bonus +12T”), visible to them alone.</w:t>
+        <w:t xml:space="preserve">Benefits run silently server-side off the ID-hash; the holder's only private trace is one wallet-history line (e.g. “Founders bonus +4T”), visible to them alone.</w:t>
       </w:r>
     </w:p>
     <w:p>
@@ -1226,7 +1737,33 @@
                 <w:sz w:val="18"/>
                 <w:szCs w:val="18"/>
               </w:rPr>
-              <w:t xml:space="preserve"> by the 20% Tuppence bonus above (the AI-uses model itself is retired).</w:t>
+              <w:t xml:space="preserve"> by the rounded-up 20% Tuppence bonus above (the AI-uses model itself is retired). The fixed </w:t>
+            </w:r>
+            <w:r>
+              <w:rPr>
+                <w:rFonts w:ascii="Calibri" w:cs="Calibri" w:eastAsia="Calibri" w:hAnsi="Calibri"/>
+                <w:b/>
+                <w:bCs/>
+                <w:i w:val="false"/>
+                <w:iCs w:val="false"/>
+                <w:color w:val="1A2433"/>
+                <w:sz w:val="18"/>
+                <w:szCs w:val="18"/>
+              </w:rPr>
+              <w:t xml:space="preserve">$2 Tuppence principle is reaffirmed, not superseded</w:t>
+            </w:r>
+            <w:r>
+              <w:rPr>
+                <w:rFonts w:ascii="Calibri" w:cs="Calibri" w:eastAsia="Calibri" w:hAnsi="Calibri"/>
+                <w:b w:val="false"/>
+                <w:bCs w:val="false"/>
+                <w:i w:val="false"/>
+                <w:iCs w:val="false"/>
+                <w:color w:val="1A2433"/>
+                <w:sz w:val="18"/>
+                <w:szCs w:val="18"/>
+              </w:rPr>
+              <w:t xml:space="preserve">.</w:t>
             </w:r>
           </w:p>
         </w:tc>
@@ -1301,7 +1838,7 @@
                 <w:sz w:val="18"/>
                 <w:szCs w:val="18"/>
               </w:rPr>
-              <w:t xml:space="preserve">$40 Business</w:t>
+              <w:t xml:space="preserve">$40 Business or $100 Elite</w:t>
             </w:r>
             <w:r>
               <w:rPr>
@@ -1372,7 +1909,7 @@
                 <w:sz w:val="18"/>
                 <w:szCs w:val="18"/>
               </w:rPr>
-              <w:t xml:space="preserve">Codex v4.2 item A7</w:t>
+              <w:t xml:space="preserve">Same-day drafts (6 Jun)</w:t>
             </w:r>
           </w:p>
         </w:tc>
@@ -1402,7 +1939,7 @@
                 <w:sz w:val="18"/>
                 <w:szCs w:val="18"/>
               </w:rPr>
-              <w:t xml:space="preserve">Preliminary Free/$5/$15 buyer tiers → </w:t>
+              <w:t xml:space="preserve">Earlier allocation drafts quoting 10/25/60/500 Tuppence per month → </w:t>
             </w:r>
             <w:r>
               <w:rPr>
@@ -1428,7 +1965,7 @@
                 <w:sz w:val="18"/>
                 <w:szCs w:val="18"/>
               </w:rPr>
-              <w:t xml:space="preserve"> by $0/$12/$20/$40/$100 (already marked in the Codex Evolution Audit).</w:t>
+              <w:t xml:space="preserve"> by the price÷2 schedule (6/10/20/50), which restores the $2 anchor and keeps Tuppence scarce enough to stay a meaningful commitment signal.</w:t>
             </w:r>
           </w:p>
         </w:tc>
@@ -1460,7 +1997,7 @@
                 <w:sz w:val="18"/>
                 <w:szCs w:val="18"/>
               </w:rPr>
-              <w:t xml:space="preserve">Outreach canon</w:t>
+              <w:t xml:space="preserve">Codex v4.2 item A7</w:t>
             </w:r>
           </w:p>
         </w:tc>
@@ -1490,33 +2027,33 @@
                 <w:sz w:val="18"/>
                 <w:szCs w:val="18"/>
               </w:rPr>
-              <w:t xml:space="preserve">The former “Founding agency/seller benefit” (featured-first + free listing marketing) → </w:t>
-            </w:r>
-            <w:r>
-              <w:rPr>
-                <w:rFonts w:ascii="Calibri" w:cs="Calibri" w:eastAsia="Calibri" w:hAnsi="Calibri"/>
-                <w:b/>
-                <w:bCs/>
-                <w:i w:val="false"/>
-                <w:iCs w:val="false"/>
-                <w:color w:val="1A2433"/>
-                <w:sz w:val="18"/>
-                <w:szCs w:val="18"/>
-              </w:rPr>
-              <w:t xml:space="preserve">replaced by the launch special</w:t>
-            </w:r>
-            <w:r>
-              <w:rPr>
-                <w:rFonts w:ascii="Calibri" w:cs="Calibri" w:eastAsia="Calibri" w:hAnsi="Calibri"/>
-                <w:b w:val="false"/>
-                <w:bCs w:val="false"/>
-                <w:i w:val="false"/>
-                <w:iCs w:val="false"/>
-                <w:color w:val="1A2433"/>
-                <w:sz w:val="18"/>
-                <w:szCs w:val="18"/>
-              </w:rPr>
-              <w:t xml:space="preserve">, which binds to people via their IDs, not to agencies. (Claim 6's first-60 cohort placement mechanic in the IP record is unaffected by this marketing change unless separately revised.)</w:t>
+              <w:t xml:space="preserve">Preliminary Free/$5/$15 buyer tiers → </w:t>
+            </w:r>
+            <w:r>
+              <w:rPr>
+                <w:rFonts w:ascii="Calibri" w:cs="Calibri" w:eastAsia="Calibri" w:hAnsi="Calibri"/>
+                <w:b/>
+                <w:bCs/>
+                <w:i w:val="false"/>
+                <w:iCs w:val="false"/>
+                <w:color w:val="1A2433"/>
+                <w:sz w:val="18"/>
+                <w:szCs w:val="18"/>
+              </w:rPr>
+              <w:t xml:space="preserve">superseded</w:t>
+            </w:r>
+            <w:r>
+              <w:rPr>
+                <w:rFonts w:ascii="Calibri" w:cs="Calibri" w:eastAsia="Calibri" w:hAnsi="Calibri"/>
+                <w:b w:val="false"/>
+                <w:bCs w:val="false"/>
+                <w:i w:val="false"/>
+                <w:iCs w:val="false"/>
+                <w:color w:val="1A2433"/>
+                <w:sz w:val="18"/>
+                <w:szCs w:val="18"/>
+              </w:rPr>
+              <w:t xml:space="preserve"> by $0/$12/$20/$40/$100 (marked in the Codex Evolution Audit).</w:t>
             </w:r>
           </w:p>
         </w:tc>
@@ -1548,7 +2085,7 @@
                 <w:sz w:val="18"/>
                 <w:szCs w:val="18"/>
               </w:rPr>
-              <w:t xml:space="preserve">EULA v1.5 → v1.6 (for counsel)</w:t>
+              <w:t xml:space="preserve">Outreach canon</w:t>
             </w:r>
           </w:p>
         </w:tc>
@@ -1556,6 +2093,94 @@
           <w:tcPr>
             <w:tcW w:type="dxa" w:w="7340"/>
             <w:shd w:fill="FFFFFF" w:color="auto" w:val="clear"/>
+            <w:tcMar>
+              <w:top w:type="dxa" w:w="85"/>
+              <w:left w:type="dxa" w:w="140"/>
+              <w:bottom w:type="dxa" w:w="85"/>
+              <w:right w:type="dxa" w:w="140"/>
+            </w:tcMar>
+          </w:tcPr>
+          <w:p>
+            <w:pPr>
+              <w:spacing w:line="260"/>
+            </w:pPr>
+            <w:r>
+              <w:rPr>
+                <w:rFonts w:ascii="Calibri" w:cs="Calibri" w:eastAsia="Calibri" w:hAnsi="Calibri"/>
+                <w:b w:val="false"/>
+                <w:bCs w:val="false"/>
+                <w:i w:val="false"/>
+                <w:iCs w:val="false"/>
+                <w:color w:val="1A2433"/>
+                <w:sz w:val="18"/>
+                <w:szCs w:val="18"/>
+              </w:rPr>
+              <w:t xml:space="preserve">The former “Founding agency/seller benefit” (featured-first + free listing marketing) → </w:t>
+            </w:r>
+            <w:r>
+              <w:rPr>
+                <w:rFonts w:ascii="Calibri" w:cs="Calibri" w:eastAsia="Calibri" w:hAnsi="Calibri"/>
+                <w:b/>
+                <w:bCs/>
+                <w:i w:val="false"/>
+                <w:iCs w:val="false"/>
+                <w:color w:val="1A2433"/>
+                <w:sz w:val="18"/>
+                <w:szCs w:val="18"/>
+              </w:rPr>
+              <w:t xml:space="preserve">replaced by the launch special</w:t>
+            </w:r>
+            <w:r>
+              <w:rPr>
+                <w:rFonts w:ascii="Calibri" w:cs="Calibri" w:eastAsia="Calibri" w:hAnsi="Calibri"/>
+                <w:b w:val="false"/>
+                <w:bCs w:val="false"/>
+                <w:i w:val="false"/>
+                <w:iCs w:val="false"/>
+                <w:color w:val="1A2433"/>
+                <w:sz w:val="18"/>
+                <w:szCs w:val="18"/>
+              </w:rPr>
+              <w:t xml:space="preserve">, which binds to people via their IDs, not to agencies. (Claim 6's first-60 cohort placement mechanic in the IP record is unaffected by this marketing change unless separately revised.)</w:t>
+            </w:r>
+          </w:p>
+        </w:tc>
+      </w:tr>
+      <w:tr>
+        <w:tc>
+          <w:tcPr>
+            <w:tcW w:type="dxa" w:w="2300"/>
+            <w:shd w:fill="F4F6FA" w:color="auto" w:val="clear"/>
+            <w:tcMar>
+              <w:top w:type="dxa" w:w="85"/>
+              <w:left w:type="dxa" w:w="140"/>
+              <w:bottom w:type="dxa" w:w="85"/>
+              <w:right w:type="dxa" w:w="140"/>
+            </w:tcMar>
+          </w:tcPr>
+          <w:p>
+            <w:pPr>
+              <w:spacing w:line="260"/>
+            </w:pPr>
+            <w:r>
+              <w:rPr>
+                <w:rFonts w:ascii="Calibri" w:cs="Calibri" w:eastAsia="Calibri" w:hAnsi="Calibri"/>
+                <w:b/>
+                <w:bCs/>
+                <w:i w:val="false"/>
+                <w:iCs w:val="false"/>
+                <w:color w:val="1A2433"/>
+                <w:sz w:val="18"/>
+                <w:szCs w:val="18"/>
+              </w:rPr>
+              <w:t xml:space="preserve">EULA v1.5 → v1.6 (for counsel)</w:t>
+            </w:r>
+          </w:p>
+        </w:tc>
+        <w:tc>
+          <w:tcPr>
+            <w:tcW w:type="dxa" w:w="7340"/>
+            <w:shd w:fill="F4F6FA" w:color="auto" w:val="clear"/>
             <w:tcMar>
               <w:top w:type="dxa" w:w="85"/>
               <w:left w:type="dxa" w:w="140"/>
@@ -1686,7 +2311,7 @@
           <w:sz w:val="21"/>
           <w:szCs w:val="21"/>
         </w:rPr>
-        <w:t xml:space="preserve">Issuing side (built, tested): `CityLauncher/emailer/launch_codes.py` — the closed number registry; env-gated email block live in all 14 outreach templates, each showing the ruby spark and the significance line.</w:t>
+        <w:t xml:space="preserve">Issuing side (built, tested): `CityLauncher/emailer/launch_codes.py` — the closed number registry; env-gated email block live in all 14 outreach templates, each showing the ruby spark, the Business-or-Elite qualifying terms and the significance line.</w:t>
       </w:r>
     </w:p>
     <w:p>
@@ -1732,7 +2357,30 @@
           <w:sz w:val="21"/>
           <w:szCs w:val="21"/>
         </w:rPr>
-        <w:t xml:space="preserve">Redemption build (next): validate number → bind ID-hash → mint badge → 1.2× allocation hook. Open input: monthly Tuppence allocations for the $12 / $20 / $100 tiers (Business = 60 locked).</w:t>
+        <w:t xml:space="preserve">Redemption build (next, fully unblocked): validate number → bind ID-hash → mint badge → +20%-rounded-up allocation hook. Allocations locked: 6 / 10 / 20 / 50 T per month (badge: 8 / 12 / 24 / 60); slots 2 / 10 / 25 / 60 / 500, badge-invariant.</w:t>
+      </w:r>
+    </w:p>
+    <w:p>
+      <w:pPr>
+        <w:pStyle w:val="ListParagraph"/>
+        <w:numPr>
+          <w:ilvl w:val="0"/>
+          <w:numId w:val="2"/>
+        </w:numPr>
+        <w:spacing w:after="80" w:line="268"/>
+      </w:pPr>
+      <w:r>
+        <w:rPr>
+          <w:rFonts w:ascii="Calibri" w:cs="Calibri" w:eastAsia="Calibri" w:hAnsi="Calibri"/>
+          <w:b w:val="false"/>
+          <w:bCs w:val="false"/>
+          <w:i w:val="false"/>
+          <w:iCs w:val="false"/>
+          <w:color w:val="1A2433"/>
+          <w:sz w:val="21"/>
+          <w:szCs w:val="21"/>
+        </w:rPr>
+        <w:t xml:space="preserve">Flood control (design note): the slot caps are the structural defence (even Elite is bounded at 500 live adverts); add a per-day new-listing velocity limit at build time so a cap cannot be dumped in one hour; bulk collections are steered to dealer/agency accounts (the agency layer), where curation is the norm. Capacity above 500 = multiple branch accounts (one branch ≈ one Elite); an Enterprise tier waits for real post-launch demand.</w:t>
       </w:r>
     </w:p>
     <w:p>
@@ -1755,7 +2403,7 @@
           <w:sz w:val="19"/>
           <w:szCs w:val="19"/>
         </w:rPr>
-        <w:t xml:space="preserve">This addendum is canon from 6 June 2026. Each named document absorbs it at its next version; until then, where any older text conflicts with this addendum, this addendum prevails.</w:t>
+        <w:t xml:space="preserve">This addendum (rev 2) is canon from 6 June 2026. Each named document absorbs it at its next version; until then, where any older text conflicts with this addendum, this addendum prevails.</w:t>
       </w:r>
     </w:p>
     <w:sectPr>
@@ -1823,7 +2471,7 @@
         <w:sz w:val="16"/>
         <w:szCs w:val="16"/>
       </w:rPr>
-      <w:t xml:space="preserve">TrustSquare — Canon Addendum №1 (Founders Badge &amp; Launch Special, 6 Jun 2026)   ·   page </w:t>
+      <w:t xml:space="preserve">TrustSquare — Canon Addendum №1 rev 2 (Founders Badge &amp; Launch Special, 6 Jun 2026)   ·   page </w:t>
     </w:r>
     <w:r>
       <w:rPr>

</xml_diff>